<commit_message>
Update four-LDR solar tracker design
Co-authored-by: arena-agent <297053741+arena-agent@users.noreply.github.com>
</commit_message>
<xml_diff>
--- a/Bao_cao_do_an_mau_bam_nang_1_truc.docx
+++ b/Bao_cao_do_an_mau_bam_nang_1_truc.docx
@@ -362,11 +362,7 @@
     <w:p>
       <w:pPr/>
       <w:r>
-        <w:rPr>
-          <w:rFonts w:ascii="Times New Roman" w:hAnsi="Times New Roman" w:eastAsia="Times New Roman"/>
-          <w:sz w:val="24"/>
-        </w:rPr>
-        <w:t>Các mô hình giá thành thấp thường dùng cặp quang trở để xác định phía sáng hơn. Tuy nhiên, hai cảm biến có thể khác độ nhạy; tín hiệu thay đổi theo nhiệt độ, nhiễu ADC, bụi, phản xạ và mây che. Nếu điều khiển trực tiếp theo tín hiệu thô, động cơ có thể dao động, quay sai hướng hoặc tiêu thụ nhiều điện năng phụ trợ. Vì vậy, cần nghiên cứu cách lọc, hiệu chuẩn và xác định độ tin cậy tín hiệu trước khi ra lệnh chuyển động.</w:t>
+        <w:t>Các mô hình giá thành thấp thường dùng nhiều cảm biến quang để so sánh cường độ sáng theo các hướng khác nhau. Tuy nhiên, hai cảm biến có thể khác độ nhạy; tín hiệu thay đổi theo nhiệt độ, nhiễu ADC, bụi, phản xạ và mây che. Nếu điều khiển trực tiếp theo tín hiệu thô, động cơ có thể dao động, quay sai hướng hoặc tiêu thụ nhiều điện năng phụ trợ. Vì vậy, cần nghiên cứu cách lọc, hiệu chuẩn và xác định độ tin cậy tín hiệu trước khi ra lệnh chuyển động.</w:t>
       </w:r>
     </w:p>
     <w:p>
@@ -390,21 +386,13 @@
     <w:p>
       <w:pPr/>
       <w:r>
-        <w:rPr>
-          <w:rFonts w:ascii="Times New Roman" w:hAnsi="Times New Roman" w:eastAsia="Times New Roman"/>
-          <w:sz w:val="24"/>
-        </w:rPr>
-        <w:t>Đối tượng kỹ thuật là tấm pin quay quanh trục ngang theo hướng Bắc–Nam, cho phép điều chỉnh hướng pháp tuyến chủ yếu trong mặt phẳng Đông–Tây. Cặp quang trở đặt ở hai phía của vách chắn tạo tín hiệu sai lệch; BH1750 được dùng làm kênh tham chiếu cường độ sáng khi dải đo phù hợp; ESP32 đọc tín hiệu, lọc, hiệu chuẩn và tính góc điều khiển. Cơ cấu chấp hành được lựa chọn theo tải và mô-men thực tế, có giới hạn hành trình ở hai đầu.</w:t>
+        <w:t>Đối tượng kỹ thuật là mô hình tấm pin bám nắng một trục, dùng một cụm bốn quang trở gắn tại bốn góc mặt pin để ước lượng sai lệch theo phương quay và phương nghiêng. Mỗi cảm biến được gá đối xứng, trục cảm quang hướng chếch ra ngoài so với pháp tuyến mặt pin. Cụm cảm biến tạo được hai thành phần sai lệch; do phạm vi cơ khí của đề tài chỉ có một trục chấp hành, thuật toán dùng thành phần ứng với trục được lắp làm lệnh điều khiển, còn thành phần còn lại được ghi nhận để đánh giá hoặc mở rộng trong tương lai.</w:t>
       </w:r>
     </w:p>
     <w:p>
       <w:pPr/>
       <w:r>
-        <w:rPr>
-          <w:rFonts w:ascii="Times New Roman" w:hAnsi="Times New Roman" w:eastAsia="Times New Roman"/>
-          <w:sz w:val="24"/>
-        </w:rPr>
-        <w:t>Báo cáo khảo sát bốn nhóm thuật toán: so sánh có ngưỡng; điều khiển tỷ lệ; điều khiển tỷ lệ có lọc, bù độ lợi và vùng chết; và phương án lai dùng tín hiệu LDR khi đủ tin cậy, chuyển sang góc thiên văn hoặc giữ vị trí khi tín hiệu suy giảm. Trọng tâm đánh giá là sai số bám, mức độ chuyển động không cần thiết và năng lượng thuần sau khi tính điện tiêu thụ của cơ cấu và bộ điều khiển.</w:t>
+        <w:t>Báo cáo khảo sát bốn nhóm thuật toán trên các tín hiệu quang đã tổng hợp từ bốn góc: so sánh có ngưỡng; điều khiển tỷ lệ; điều khiển tỷ lệ có lọc, bù độ lợi và vùng chết; và phương án lai dùng tín hiệu cảm biến khi đủ tin cậy, chuyển sang góc thiên văn hoặc giữ vị trí khi tín hiệu suy giảm. Trọng tâm đánh giá là khả năng nhận biết chiều quay/chiều nghiêng, sai số bám trên trục được điều khiển, mức độ chuyển động không cần thiết và năng lượng thuần sau khi tính điện năng phụ trợ.</w:t>
       </w:r>
     </w:p>
     <w:p>
@@ -446,11 +434,7 @@
         <w:ind w:left="504" w:hanging="259"/>
       </w:pPr>
       <w:r>
-        <w:rPr>
-          <w:rFonts w:ascii="Times New Roman" w:hAnsi="Times New Roman" w:eastAsia="Times New Roman"/>
-          <w:sz w:val="23"/>
-        </w:rPr>
-        <w:t>Thiết kế cấu trúc cảm biến vi sai có vách chắn và lựa chọn bộ điều khiển, cơ cấu chấp hành cùng phần tử bảo vệ phù hợp với mô hình.</w:t>
+        <w:t>Thiết kế cụm bốn LDR tại bốn góc pin, xác định góc gá hướng ra ngoài và xây dựng quy tắc so sánh trái–phải, trên–dưới để tạo hai tín hiệu sai lệch.</w:t>
       </w:r>
     </w:p>
     <w:p>
@@ -492,11 +476,7 @@
     <w:p>
       <w:pPr/>
       <w:r>
-        <w:rPr>
-          <w:rFonts w:ascii="Times New Roman" w:hAnsi="Times New Roman" w:eastAsia="Times New Roman"/>
-          <w:sz w:val="24"/>
-        </w:rPr>
-        <w:t>Đối tượng nghiên cứu là thuật toán xác định góc quay cho hệ bám nắng một trục dùng cặp quang trở; cấu hình tham khảo gồm ESP32, cảm biến BH1750, đồng hồ thời gian thực và một cơ cấu chấp hành có giới hạn hành trình. Địa điểm tính toán dự kiến là khu vực Mỹ Hào, Hưng Yên (xấp xỉ 20,93° Bắc, 106,06° Đông); tọa độ chính thức cần được xác nhận theo nơi đặt mô hình.</w:t>
+        <w:t>Đối tượng nghiên cứu là thuật toán xử lý tín hiệu của cụm bốn quang trở đặt ở bốn góc mặt pin để xác định chiều sai lệch theo hai phương. Mô hình cơ khí trong phạm vi báo cáo vẫn là tracker một trục; cấu hình tham khảo gồm ESP32, BH1750 làm kênh tham chiếu, đồng hồ thời gian thực và một cơ cấu chấp hành có giới hạn hành trình. Địa điểm tính toán dự kiến là khu vực Mỹ Hào, Hưng Yên (xấp xỉ 20,93° Bắc, 106,06° Đông); tọa độ chính thức cần được xác nhận theo nơi đặt mô hình. Thành phần sai lệch của trục chưa được cơ khí điều khiển chỉ được ghi nhận, không giả định rằng mô hình một trục có thể điều chỉnh đồng thời cả hai trục.</w:t>
       </w:r>
     </w:p>
     <w:p>
@@ -615,23 +595,27 @@
       </w:r>
     </w:p>
     <w:p>
-      <w:pPr/>
+      <w:pPr>
+        <w:jc w:val="both"/>
+      </w:pPr>
       <w:r>
-        <w:rPr>
-          <w:rFonts w:ascii="Times New Roman" w:hAnsi="Times New Roman" w:eastAsia="Times New Roman"/>
-          <w:sz w:val="24"/>
-        </w:rPr>
-        <w:t>Mô-đun quang điện chuyển một phần năng lượng bức xạ thành điện năng một chiều nhờ hiệu ứng quang điện trong vật liệu bán dẫn. Dòng điện đầu ra phụ thuộc đáng kể vào cường độ bức xạ chiếu lên bề mặt; điện áp và công suất còn chịu ảnh hưởng của nhiệt độ mô-đun, đặc tính tải và bộ biến đổi điện. Góc giữa tia nắng trực tiếp và pháp tuyến tấm pin càng lớn thì thành phần bức xạ trực tiếp hữu ích trên mặt pin càng giảm [1].</w:t>
+        <w:t>Mô-đun quang điện gồm nhiều tế bào bán dẫn ghép nối tiếp/song song để tạo điện áp và dòng điện phù hợp. Tế bào thường dựa trên tiếp giáp bán dẫn p–n; khi photon có năng lượng phù hợp được hấp thụ, các hạt tải điện được tạo ra và phân tách, hình thành dòng điện một chiều. Mô-đun thương mại còn có kính bảo vệ, lớp đóng gói, mặt sau, khung và hộp nối; cấu tạo cụ thể thay đổi theo loại mô-đun.</w:t>
       </w:r>
     </w:p>
     <w:p>
-      <w:pPr/>
+      <w:pPr>
+        <w:jc w:val="both"/>
+      </w:pPr>
       <w:r>
-        <w:rPr>
-          <w:rFonts w:ascii="Times New Roman" w:hAnsi="Times New Roman" w:eastAsia="Times New Roman"/>
-          <w:sz w:val="24"/>
-        </w:rPr>
-        <w:t>Trong mô hình, pin vừa là đối tượng được định hướng vừa là nguồn điện cần đánh giá. Điện áp đơn lẻ không đủ để xác định điện năng; cần đo đồng thời điện áp và dòng điện, sau đó tích phân công suất theo thời gian. Bụi bẩn, nhiệt độ, che bóng và khác biệt giữa hai mô-đun đối chứng phải được kiểm soát khi so sánh.</w:t>
+        <w:t>Các thông số cơ bản trên nhãn gồm công suất cực đại Pmax, điện áp hở mạch Voc, dòng ngắn mạch Isc, điện áp và dòng tại điểm công suất cực đại Vmp, Imp, cùng hệ số nhiệt. Thông số danh định thường công bố theo điều kiện thử chuẩn STC; ngoài thực tế, bức xạ, nhiệt độ tế bào, phổ ánh sáng, tải điện và che bóng làm các giá trị thay đổi. Tăng bức xạ thường làm dòng quang điện tăng; nhiệt độ tế bào tăng thường làm điện áp và công suất cực đại suy giảm.</w:t>
+      </w:r>
+    </w:p>
+    <w:p>
+      <w:pPr>
+        <w:jc w:val="both"/>
+      </w:pPr>
+      <w:r>
+        <w:t>Góc giữa tia trực tiếp và pháp tuyến mặt pin ảnh hưởng thành phần bức xạ trực tiếp thu được; tracker chỉ thay đổi hướng hình học, không loại bỏ ảnh hưởng của mây hay nhiệt độ. Khi so sánh chế độ cố định và bám nắng cần đo đồng thời U và I, tính P = U×I rồi tích phân theo thời gian; điện áp đơn lẻ không đại diện cho năng lượng [1].</w:t>
       </w:r>
     </w:p>
     <w:p>
@@ -643,160 +627,19 @@
       </w:r>
     </w:p>
     <w:p>
-      <w:pPr/>
+      <w:pPr>
+        <w:jc w:val="both"/>
+      </w:pPr>
       <w:r>
-        <w:rPr>
-          <w:rFonts w:ascii="Times New Roman" w:hAnsi="Times New Roman" w:eastAsia="Times New Roman"/>
-          <w:sz w:val="24"/>
-        </w:rPr>
-        <w:t>LDR là điện trở quang có giá trị giảm khi độ rọi tăng. Cảm biến thường được ghép với điện trở cố định thành mạch chia áp; điện áp nút giữa được đưa vào bộ ADC của vi điều khiển. Quan hệ điện trở–độ rọi không tuyến tính và thay đổi theo từng linh kiện, nhiệt độ, phổ ánh sáng và cách lắp đặt. Vì vậy, hai LDR cần được đo/hiệu chuẩn theo cặp và không nên mặc định giá trị ADC tuyệt đối giống nhau.</w:t>
-      </w:r>
-    </w:p>
-    <w:p>
-      <w:pPr/>
-      <w:r>
-        <w:rPr>
-          <w:rFonts w:ascii="Times New Roman" w:hAnsi="Times New Roman" w:eastAsia="Times New Roman"/>
-          <w:sz w:val="24"/>
-        </w:rPr>
-        <w:t>Trong cấu hình vi sai, hai LDR đặt đối xứng ở hai bên một vách chắn. Khi pháp tuyến tấm pin gần hướng sáng, hai tín hiệu xấp xỉ cân bằng; khi lệch, bóng vách tạo sai lệch. Vách quá thấp làm tín hiệu yếu, vách quá cao khiến vùng đo tuyến tính hẹp. Tỉ số kích thước vách cần được xác định từ thử nghiệm hình học và độ nhạy thực tế.</w:t>
+        <w:t>Quang trở (Light Dependent Resistor – LDR) là linh kiện quang dẫn: độ dẫn điện của vật liệu bán dẫn thay đổi theo lượng ánh sáng chiếu tới. Trong điều kiện sáng hơn, điện trở LDR thường giảm; khi ánh sáng yếu hoặc tối, điện trở tăng. Đặc tuyến điện trở–độ rọi không tuyến tính và phụ thuộc loại linh kiện, phổ ánh sáng, nhiệt độ, thời gian đáp ứng và sai số giữa các mẫu.</w:t>
       </w:r>
     </w:p>
     <w:p>
       <w:pPr>
-        <w:spacing w:after="40"/>
-        <w:ind w:firstLine="0"/>
-        <w:jc w:val="center"/>
+        <w:jc w:val="both"/>
       </w:pPr>
       <w:r>
-        <w:drawing>
-          <wp:inline xmlns:a="http://schemas.openxmlformats.org/drawingml/2006/main" xmlns:pic="http://schemas.openxmlformats.org/drawingml/2006/picture">
-            <wp:extent cx="5303520" cy="2908724"/>
-            <wp:docPr id="1" name="Picture 1"/>
-            <wp:cNvGraphicFramePr>
-              <a:graphicFrameLocks noChangeAspect="1"/>
-            </wp:cNvGraphicFramePr>
-            <a:graphic>
-              <a:graphicData uri="http://schemas.openxmlformats.org/drawingml/2006/picture">
-                <pic:pic>
-                  <pic:nvPicPr>
-                    <pic:cNvPr id="0" name="image.png"/>
-                    <pic:cNvPicPr/>
-                  </pic:nvPicPr>
-                  <pic:blipFill>
-                    <a:blip r:embed="rId10"/>
-                    <a:stretch>
-                      <a:fillRect/>
-                    </a:stretch>
-                  </pic:blipFill>
-                  <pic:spPr>
-                    <a:xfrm>
-                      <a:off x="0" y="0"/>
-                      <a:ext cx="5303520" cy="2908724"/>
-                    </a:xfrm>
-                    <a:prstGeom prst="rect"/>
-                  </pic:spPr>
-                </pic:pic>
-              </a:graphicData>
-            </a:graphic>
-          </wp:inline>
-        </w:drawing>
-      </w:r>
-    </w:p>
-    <w:p>
-      <w:pPr>
-        <w:pStyle w:val="Caption"/>
-        <w:ind w:firstLine="0"/>
-        <w:jc w:val="center"/>
-      </w:pPr>
-      <w:r>
-        <w:rPr>
-          <w:rFonts w:ascii="Times New Roman" w:hAnsi="Times New Roman" w:eastAsia="Times New Roman"/>
-          <w:color w:val="505050"/>
-          <w:sz w:val="20"/>
-        </w:rPr>
-        <w:t>Hình 2.1. Nguyên lý cặp LDR vi sai có vách chắn.</w:t>
-      </w:r>
-    </w:p>
-    <w:p>
-      <w:pPr>
-        <w:spacing w:before="60" w:after="140"/>
-        <w:ind w:firstLine="0"/>
-        <w:jc w:val="center"/>
-      </w:pPr>
-      <w:r>
-        <w:rPr>
-          <w:rFonts w:ascii="Times New Roman" w:hAnsi="Times New Roman" w:eastAsia="Times New Roman"/>
-          <w:i/>
-          <w:sz w:val="23"/>
-        </w:rPr>
-        <w:t>e = (L_T / g − L_Đ) / (L_T / g + L_Đ + ε)</w:t>
-      </w:r>
-    </w:p>
-    <w:p>
-      <w:pPr/>
-      <w:r>
-        <w:rPr>
-          <w:rFonts w:ascii="Times New Roman" w:hAnsi="Times New Roman" w:eastAsia="Times New Roman"/>
-          <w:sz w:val="24"/>
-        </w:rPr>
-        <w:t>Trong đó L_Đ và L_T là tín hiệu hai phía, g là hệ số bù độ nhạy đo được khi hiệu chuẩn, ε là số dương nhỏ tránh chia cho không. Chuẩn hóa theo tổng sáng giúp giảm phụ thuộc vào mức sáng chung; tuy vậy, khi tổng tín hiệu quá nhỏ thì e không đáng tin cậy và cần khóa hiệu chỉnh cảm biến.</w:t>
-      </w:r>
-    </w:p>
-    <w:p>
-      <w:pPr>
-        <w:spacing w:after="40"/>
-        <w:ind w:firstLine="0"/>
-        <w:jc w:val="center"/>
-      </w:pPr>
-      <w:r>
-        <w:drawing>
-          <wp:inline xmlns:a="http://schemas.openxmlformats.org/drawingml/2006/main" xmlns:pic="http://schemas.openxmlformats.org/drawingml/2006/picture">
-            <wp:extent cx="5577840" cy="3160776"/>
-            <wp:docPr id="2" name="Picture 2"/>
-            <wp:cNvGraphicFramePr>
-              <a:graphicFrameLocks noChangeAspect="1"/>
-            </wp:cNvGraphicFramePr>
-            <a:graphic>
-              <a:graphicData uri="http://schemas.openxmlformats.org/drawingml/2006/picture">
-                <pic:pic>
-                  <pic:nvPicPr>
-                    <pic:cNvPr id="0" name="image.png"/>
-                    <pic:cNvPicPr/>
-                  </pic:nvPicPr>
-                  <pic:blipFill>
-                    <a:blip r:embed="rId11"/>
-                    <a:stretch>
-                      <a:fillRect/>
-                    </a:stretch>
-                  </pic:blipFill>
-                  <pic:spPr>
-                    <a:xfrm>
-                      <a:off x="0" y="0"/>
-                      <a:ext cx="5577840" cy="3160776"/>
-                    </a:xfrm>
-                    <a:prstGeom prst="rect"/>
-                  </pic:spPr>
-                </pic:pic>
-              </a:graphicData>
-            </a:graphic>
-          </wp:inline>
-        </w:drawing>
-      </w:r>
-    </w:p>
-    <w:p>
-      <w:pPr>
-        <w:pStyle w:val="Caption"/>
-        <w:ind w:firstLine="0"/>
-        <w:jc w:val="center"/>
-      </w:pPr>
-      <w:r>
-        <w:rPr>
-          <w:rFonts w:ascii="Times New Roman" w:hAnsi="Times New Roman" w:eastAsia="Times New Roman"/>
-          <w:color w:val="505050"/>
-          <w:sz w:val="20"/>
-        </w:rPr>
-        <w:t>Hình 2.2. Ví dụ đặc tính sai lệch chuẩn hóa theo góc lệch của cặp LDR.</w:t>
+        <w:t>Để đưa tín hiệu LDR vào vi điều khiển, thường mắc linh kiện với một điện trở cố định thành cầu phân áp rồi đọc điện áp tại điểm giữa bằng ADC. ADC có thể tăng hoặc giảm khi chiếu sáng tùy vị trí LDR trong cầu phân áp, vì vậy cần xem sơ đồ mạch và kiểm tra thực tế. LDR có giá thành thấp, mạch đơn giản nhưng độ lặp lại và tốc độ đáp ứng thường thấp hơn photodiode; cần che bụi/ẩm và hiệu chuẩn nếu dùng để so sánh định lượng.</w:t>
       </w:r>
     </w:p>
     <w:p>
@@ -808,23 +651,19 @@
       </w:r>
     </w:p>
     <w:p>
-      <w:pPr/>
+      <w:pPr>
+        <w:jc w:val="both"/>
+      </w:pPr>
       <w:r>
-        <w:rPr>
-          <w:rFonts w:ascii="Times New Roman" w:hAnsi="Times New Roman" w:eastAsia="Times New Roman"/>
-          <w:sz w:val="24"/>
-        </w:rPr>
-        <w:t>Photodiode tạo dòng quang khi ánh sáng chiếu vào vùng tiếp giáp bán dẫn; trong miền làm việc phù hợp, dòng quang tăng gần tỷ lệ với công suất bức xạ tới. Photodiode có tốc độ đáp ứng cao và có thể ghép thành cặp hoặc mảng nhiều phần tử để đo sai lệch hướng. Do tín hiệu dòng nhỏ, mạch thường cần khuếch đại chuyển dòng–điện áp (transimpedance amplifier) và che chắn ánh sáng ngoài vùng cần đo.</w:t>
+        <w:t>Photodiode là linh kiện bán dẫn có vùng tiếp giáp p–n hoặc PIN nhạy với ánh sáng. Photon được hấp thụ tạo cặp điện tử–lỗ trống và sinh dòng quang. Photodiode có thể làm việc ở chế độ quang điện áp (không phân cực ngoài) hoặc quang dẫn (thường phân cực ngược); chế độ và mạch đo được chọn theo yêu cầu về tốc độ, nhiễu và tuyến tính.</w:t>
       </w:r>
     </w:p>
     <w:p>
-      <w:pPr/>
+      <w:pPr>
+        <w:jc w:val="both"/>
+      </w:pPr>
       <w:r>
-        <w:rPr>
-          <w:rFonts w:ascii="Times New Roman" w:hAnsi="Times New Roman" w:eastAsia="Times New Roman"/>
-          <w:sz w:val="24"/>
-        </w:rPr>
-        <w:t>So với LDR, photodiode thường đáp ứng nhanh và có tính lặp tốt hơn nhưng yêu cầu mạch analog, căn chỉnh và hiệu chuẩn cẩn thận hơn. Trong phương án hiện tại, LDR là cảm biến chính vì giá thành thấp và dễ triển khai; photodiode là phương án thay thế để khảo sát nếu cần tăng tốc độ hoặc độ ổn định đo.</w:t>
+        <w:t>Dòng quang thường nhỏ nên mạch đo hay dùng bộ khuếch đại chuyển dòng–điện áp (TIA), điện trở hồi tiếp và tụ bù để ổn định. Photodiode thường đáp ứng nhanh, có tính lặp tốt và phù hợp đo biến thiên ánh sáng; hạn chế là mạch phức tạp hơn, cần căn chỉnh, che sáng ngoài ý muốn và chọn dải phổ phù hợp. Trong cấu hình đề tài, photodiode được giới thiệu như phương án cảm biến thay thế, không mặc định lắp chung với LDR.</w:t>
       </w:r>
     </w:p>
     <w:p>
@@ -836,23 +675,27 @@
       </w:r>
     </w:p>
     <w:p>
-      <w:pPr/>
+      <w:pPr>
+        <w:jc w:val="both"/>
+      </w:pPr>
       <w:r>
-        <w:rPr>
-          <w:rFonts w:ascii="Times New Roman" w:hAnsi="Times New Roman" w:eastAsia="Times New Roman"/>
-          <w:sz w:val="24"/>
-        </w:rPr>
-        <w:t>Arduino là hệ sinh thái vi điều khiển và phần mềm dễ tiếp cận, thuận lợi cho đọc cảm biến, xuất xung điều khiển servo và thử nghiệm thuật toán cơ bản. ESP32 tích hợp nhiều ngoại vi, giao tiếp và khả năng xử lý cao hơn, phù hợp khi cần tính góc Mặt Trời, lưu dữ liệu hoặc truyền dữ liệu không dây. Cả hai nền tảng đều cần lưu ý dải điện áp đầu vào ADC, nhiễu nguồn, mức logic và cách dùng chân ngoại vi theo đúng bo mạch [8, 9].</w:t>
+        <w:t>Arduino là hệ sinh thái bo mạch và công cụ lập trình thuận tiện cho nguyên mẫu: đọc ngõ vào analog, xử lý số, giao tiếp I²C/UART và phát xung điều khiển. Số kênh ADC, mức điện áp logic, bộ định thời và khả năng xử lý thay đổi theo từng bo mạch; cần kiểm tra tài liệu đúng phiên bản trước khi đấu nối.</w:t>
       </w:r>
     </w:p>
     <w:p>
-      <w:pPr/>
+      <w:pPr>
+        <w:jc w:val="both"/>
+      </w:pPr>
       <w:r>
-        <w:rPr>
-          <w:rFonts w:ascii="Times New Roman" w:hAnsi="Times New Roman" w:eastAsia="Times New Roman"/>
-          <w:sz w:val="24"/>
-        </w:rPr>
-        <w:t>Trong đề tài này chọn ESP32 làm bộ điều khiển chính. Arduino được trình bày như một nền tảng thay thế tương thích về nguyên lý; không kết nối đồng thời hai bộ điều khiển trong cấu hình được đề xuất. Khi thay đổi nền tảng, cần hiệu chuẩn lại ADC, sửa chân giao tiếp và kiểm tra thư viện tính vị trí Mặt Trời.</w:t>
+        <w:t>ESP32 được chọn làm bộ điều khiển trong báo cáo này vì có nhiều ngoại vi, có thể đọc nhiều kênh cảm biến, giao tiếp RTC/thiết bị ghi dữ liệu và thực hiện tính toán vị trí Mặt Trời. Dải điện áp đầu vào của ADC và khả năng tuyến tính phụ thuộc cấu hình/chip; không đưa tín hiệu 5 V trực tiếp vào chân ESP32 nếu chưa có mạch chia áp hoặc chuyển mức phù hợp. Nguồn logic cần được lọc và tách khỏi nhiễu do động cơ [8].</w:t>
+      </w:r>
+    </w:p>
+    <w:p>
+      <w:pPr>
+        <w:jc w:val="both"/>
+      </w:pPr>
+      <w:r>
+        <w:t>Arduino được nêu để so sánh hoặc thay thế khi cần nền tảng phổ biến, dễ thử nghiệm. Không sử dụng đồng thời Arduino và ESP32 trong cấu hình đề xuất; nếu thay bo phải cập nhật chân, dải ADC, thư viện, tần số điều khiển và hiệu chuẩn cảm biến [9].</w:t>
       </w:r>
     </w:p>
     <w:p>
@@ -864,23 +707,27 @@
       </w:r>
     </w:p>
     <w:p>
-      <w:pPr/>
+      <w:pPr>
+        <w:jc w:val="both"/>
+      </w:pPr>
       <w:r>
-        <w:rPr>
-          <w:rFonts w:ascii="Times New Roman" w:hAnsi="Times New Roman" w:eastAsia="Times New Roman"/>
-          <w:sz w:val="24"/>
-        </w:rPr>
-        <w:t>Servo vị trí tích hợp mạch điều khiển và phần tử hồi tiếp bên trong; bộ điều khiển ngoài gửi tín hiệu đặt vị trí, thường bằng độ rộng xung theo quy ước của nhà sản xuất. Servo thuận tiện cho mô hình nhỏ vì có thể đặt góc trực tiếp và không cần thiết kế vòng điều khiển dòng riêng. Tuy nhiên, hành trình và mô-men khác nhau giữa các loại; không được chọn chỉ theo điện áp hoặc kích thước vỏ.</w:t>
+        <w:t>Servo vị trí thường gồm động cơ DC, hộp giảm tốc, mạch điều khiển và cảm biến hồi tiếp vị trí bên trong (thường là biến trở hoặc cảm biến tương đương). Bộ điều khiển ngoài gửi xung đặt vị trí; servo tự điều chỉnh để đưa trục tới góc yêu cầu trong dải làm việc. Quan hệ giữa độ rộng xung và góc, tốc độ, mô-men, điện áp và dòng làm việc phụ thuộc từng mẫu servo, cần hiệu chuẩn theo datasheet.</w:t>
       </w:r>
     </w:p>
     <w:p>
-      <w:pPr/>
+      <w:pPr>
+        <w:jc w:val="both"/>
+      </w:pPr>
       <w:r>
-        <w:rPr>
-          <w:rFonts w:ascii="Times New Roman" w:hAnsi="Times New Roman" w:eastAsia="Times New Roman"/>
-          <w:sz w:val="24"/>
-        </w:rPr>
-        <w:t>Servo hobby chỉ phù hợp với tấm pin nhẹ, trục được cân bằng và tải gió nhỏ. Nếu mô-men yêu cầu lớn hoặc mô hình đặt ngoài trời, cần dùng servo công nghiệp, động cơ giảm tốc có phản hồi góc hoặc cơ cấu vít me/linear actuator có giới hạn hành trình. Nguồn động cơ phải tách phù hợp khỏi nguồn logic, nối chung điểm tham chiếu khi cần, và không cấp dòng servo lớn trực tiếp từ chân 5 V của bo vi điều khiển.</w:t>
+        <w:t>Khi chọn cơ cấu phải xét mô-men giữ, tải do trọng lượng, khoảng cách trọng tâm tới trục, ma sát, tải gió, tốc độ mong muốn và độ rơ. Servo hobby phù hợp với mô hình nhỏ, được cân bằng và ít chịu gió; không dùng servo nhỏ để quay trực tiếp tấm pin nặng. Với tải lớn có thể dùng servo mô-men cao, động cơ DC giảm tốc có phản hồi góc, động cơ bước hoặc cơ cấu vít me/linear actuator.</w:t>
+      </w:r>
+    </w:p>
+    <w:p>
+      <w:pPr>
+        <w:jc w:val="both"/>
+      </w:pPr>
+      <w:r>
+        <w:t>Nguồn servo/động cơ phải đáp ứng dòng khởi động và dòng kẹt trục. Không cấp tải động cơ lớn trực tiếp từ chân nguồn của vi điều khiển; bố trí nguồn riêng, mass tham chiếu chung khi cần, tụ lọc và dây dẫn phù hợp để hạn chế sụt áp/nhiễu ADC.</w:t>
       </w:r>
     </w:p>
     <w:p>
@@ -892,13 +739,19 @@
       </w:r>
     </w:p>
     <w:p>
-      <w:pPr/>
+      <w:pPr>
+        <w:jc w:val="both"/>
+      </w:pPr>
       <w:r>
-        <w:rPr>
-          <w:rFonts w:ascii="Times New Roman" w:hAnsi="Times New Roman" w:eastAsia="Times New Roman"/>
-          <w:sz w:val="24"/>
-        </w:rPr>
-        <w:t>Công tắc hành trình phát hiện cơ cấu đã đến giới hạn cơ khí. Với trục một chiều có thể bố trí một công tắc tại mỗi đầu hành trình; tín hiệu được đọc bằng ngõ vào số có điện trở kéo lên/kéo xuống. Có thể ưu tiên tiếp điểm thường đóng để phát hiện một số lỗi đứt dây, đồng thời kết hợp chặn mềm trong chương trình với ngắt phần cứng ở mức driver nếu thiết kế cho phép. Khi chạm giới hạn, hệ thống phải dừng chuyển động theo hướng đi xa hơn và vẫn cho phép thoát khỏi công tắc theo hướng ngược lại.</w:t>
+        <w:t>Công tắc hành trình là công tắc cơ điện được tác động bởi cần gạt, con lăn hoặc nút nhấn khi cơ cấu đến vị trí giới hạn. Nhiều loại có tiếp điểm COM, NO (thường mở) và NC (thường đóng); NC thường được ưu tiên trong mạch bảo vệ vì dây đứt có thể được nhận biết như trạng thái bất thường. Khi chọn cần xét lực tác động, hành trình, dòng/điện áp tiếp điểm và độ bền cơ.</w:t>
+      </w:r>
+    </w:p>
+    <w:p>
+      <w:pPr>
+        <w:jc w:val="both"/>
+      </w:pPr>
+      <w:r>
+        <w:t>Công tắc có thể đưa tín hiệu về ngõ vào số để chương trình dừng lệnh, đồng thời có thể mắc vào đường liên động của driver nếu thiết kế yêu cầu mức bảo vệ phần cứng. Cần chống dội tiếp điểm, đặt công tắc trước điểm va chạm và cấu hình sao cho khi một đầu giới hạn tác động thì chặn chuyển động đi xa hơn nhưng vẫn cho phép cơ cấu quay ngược để thoát.</w:t>
       </w:r>
     </w:p>
     <w:p>
@@ -2167,11 +2020,7 @@
     <w:p>
       <w:pPr/>
       <w:r>
-        <w:rPr>
-          <w:rFonts w:ascii="Times New Roman" w:hAnsi="Times New Roman" w:eastAsia="Times New Roman"/>
-          <w:sz w:val="24"/>
-        </w:rPr>
-        <w:t>Có thể lấy nhiều mẫu ADC trong mỗi chu kỳ, dùng trung vị để loại điểm đột biến rồi lọc thông thấp hoặc trung bình trượt mũ. Bù sai khác độ lợi giữa hai LDR trước khi tính sai lệch; sử dụng vùng chết để tránh động cơ chạy do nhiễu nhỏ; dùng ngưỡng bật/tắt khác nhau để tránh chuyển chế độ liên tục. Thời gian lấy mẫu, hệ số lọc và vùng chết cần hiệu chỉnh bằng dữ liệu đo.</w:t>
+        <w:t>Có thể lấy nhiều mẫu ADC trong mỗi chu kỳ, dùng trung vị để loại điểm đột biến rồi lọc thông thấp hoặc trung bình trượt mũ. Bù sai khác độ lợi giữa bốn kênh LDR trước khi tổng hợp sai lệch trái–phải và trên–dưới; sử dụng vùng chết để tránh động cơ chạy do nhiễu nhỏ; dùng ngưỡng bật/tắt khác nhau để tránh chuyển chế độ liên tục. Thời gian lấy mẫu, hệ số lọc và vùng chết cần hiệu chỉnh bằng dữ liệu đo.</w:t>
       </w:r>
     </w:p>
     <w:p>
@@ -2206,69 +2055,11 @@
       </w:r>
     </w:p>
     <w:p>
-      <w:pPr/>
-      <w:r>
-        <w:rPr>
-          <w:rFonts w:ascii="Times New Roman" w:hAnsi="Times New Roman" w:eastAsia="Times New Roman"/>
-          <w:sz w:val="24"/>
-        </w:rPr>
-        <w:t>Phương án đề xuất gồm tấm pin nhỏ trên trục ngang Bắc–Nam; cặp LDR và vách chắn; BH1750 làm kênh tham chiếu [10]; ESP32; đồng hồ thời gian thực DS3231 [11]; servo vị trí mô-men phù hợp hoặc cơ cấu giảm tốc; hai công tắc hành trình; khối nguồn và khối đo điện áp/dòng khi thực hiện đánh giá năng lượng. Chọn servo chỉ khi mô-men tính toán và tải gió cho phép; nếu không, thay bằng actuator có hộp giảm tốc và hồi tiếp vị trí.</w:t>
-      </w:r>
-    </w:p>
-    <w:p>
       <w:pPr>
-        <w:spacing w:after="40"/>
-        <w:ind w:firstLine="0"/>
-        <w:jc w:val="center"/>
+        <w:jc w:val="both"/>
       </w:pPr>
       <w:r>
-        <w:drawing>
-          <wp:inline xmlns:a="http://schemas.openxmlformats.org/drawingml/2006/main" xmlns:pic="http://schemas.openxmlformats.org/drawingml/2006/picture">
-            <wp:extent cx="5577840" cy="4816585"/>
-            <wp:docPr id="3" name="Picture 3"/>
-            <wp:cNvGraphicFramePr>
-              <a:graphicFrameLocks noChangeAspect="1"/>
-            </wp:cNvGraphicFramePr>
-            <a:graphic>
-              <a:graphicData uri="http://schemas.openxmlformats.org/drawingml/2006/picture">
-                <pic:pic>
-                  <pic:nvPicPr>
-                    <pic:cNvPr id="0" name="image.png"/>
-                    <pic:cNvPicPr/>
-                  </pic:nvPicPr>
-                  <pic:blipFill>
-                    <a:blip r:embed="rId13"/>
-                    <a:stretch>
-                      <a:fillRect/>
-                    </a:stretch>
-                  </pic:blipFill>
-                  <pic:spPr>
-                    <a:xfrm>
-                      <a:off x="0" y="0"/>
-                      <a:ext cx="5577840" cy="4816585"/>
-                    </a:xfrm>
-                    <a:prstGeom prst="rect"/>
-                  </pic:spPr>
-                </pic:pic>
-              </a:graphicData>
-            </a:graphic>
-          </wp:inline>
-        </w:drawing>
-      </w:r>
-    </w:p>
-    <w:p>
-      <w:pPr>
-        <w:pStyle w:val="Caption"/>
-        <w:ind w:firstLine="0"/>
-        <w:jc w:val="center"/>
-      </w:pPr>
-      <w:r>
-        <w:rPr>
-          <w:rFonts w:ascii="Times New Roman" w:hAnsi="Times New Roman" w:eastAsia="Times New Roman"/>
-          <w:color w:val="505050"/>
-          <w:sz w:val="20"/>
-        </w:rPr>
-        <w:t>Hình 3.1. Sơ đồ khối hệ thống bám nắng một trục.</w:t>
+        <w:t>Phương án đo dùng bốn LDR gắn ở bốn góc mặt pin, ký hiệu trên-trái (L_TT), trên-phải (L_PT), dưới-trái (L_TD) và dưới-phải (L_PD). Mỗi LDR được đặt trên giá đỡ đối xứng, trục cảm quang nghiêng ra ngoài so với pháp tuyến mặt pin một góc β_s; bốn góc gá bằng nhau để độ nhạy các hướng có thể so sánh. Ánh sáng từ mỗi vùng trời chiếu vào một cảm biến khác nhau, tạo cơ sở suy ra hướng lệch theo hai phương.</w:t>
       </w:r>
     </w:p>
     <w:tbl>
@@ -2280,9 +2071,9 @@
         <w:tblLook w:firstColumn="1" w:firstRow="1" w:lastColumn="0" w:lastRow="0" w:noHBand="0" w:noVBand="1" w:val="04A0"/>
       </w:tblPr>
       <w:tblGrid>
-        <w:gridCol w:w="1584"/>
-        <w:gridCol w:w="3024"/>
-        <w:gridCol w:w="4248"/>
+        <w:gridCol w:w="1656"/>
+        <w:gridCol w:w="3528"/>
+        <w:gridCol w:w="3672"/>
       </w:tblGrid>
       <w:tr>
         <w:trPr>
@@ -2290,7 +2081,7 @@
         </w:trPr>
         <w:tc>
           <w:tcPr>
-            <w:tcW w:type="dxa" w:w="3010"/>
+            <w:tcW w:type="dxa" w:w="1656"/>
             <w:vAlign w:val="center"/>
             <w:shd w:fill="D9EAF7"/>
           </w:tcPr>
@@ -2313,7 +2104,7 @@
         </w:tc>
         <w:tc>
           <w:tcPr>
-            <w:tcW w:type="dxa" w:w="3010"/>
+            <w:tcW w:type="dxa" w:w="3528"/>
             <w:vAlign w:val="center"/>
             <w:shd w:fill="D9EAF7"/>
           </w:tcPr>
@@ -2330,13 +2121,13 @@
                 <w:b/>
                 <w:sz w:val="19"/>
               </w:rPr>
-              <w:t>Phương án thực hiện</w:t>
+              <w:t>Cấu hình đề xuất</w:t>
             </w:r>
           </w:p>
         </w:tc>
         <w:tc>
           <w:tcPr>
-            <w:tcW w:type="dxa" w:w="3010"/>
+            <w:tcW w:type="dxa" w:w="3672"/>
             <w:vAlign w:val="center"/>
             <w:shd w:fill="D9EAF7"/>
           </w:tcPr>
@@ -2353,7 +2144,7 @@
                 <w:b/>
                 <w:sz w:val="19"/>
               </w:rPr>
-              <w:t>Lưu ý thiết kế</w:t>
+              <w:t>Nhiệm vụ</w:t>
             </w:r>
           </w:p>
         </w:tc>
@@ -2361,14 +2152,13 @@
       <w:tr>
         <w:tc>
           <w:tcPr>
-            <w:tcW w:type="dxa" w:w="1584"/>
+            <w:tcW w:type="dxa" w:w="1656"/>
             <w:vAlign w:val="center"/>
           </w:tcPr>
           <w:p>
             <w:pPr>
               <w:spacing w:line="240" w:lineRule="auto" w:after="20"/>
               <w:ind w:firstLine="0"/>
-              <w:jc w:val="left"/>
             </w:pPr>
             <w:r/>
             <w:r>
@@ -2376,20 +2166,19 @@
                 <w:rFonts w:ascii="Times New Roman" w:hAnsi="Times New Roman" w:eastAsia="Times New Roman"/>
                 <w:sz w:val="19"/>
               </w:rPr>
-              <w:t>Cảm biến hướng</w:t>
+              <w:t>Cảm biến</w:t>
             </w:r>
           </w:p>
         </w:tc>
         <w:tc>
           <w:tcPr>
-            <w:tcW w:type="dxa" w:w="3024"/>
+            <w:tcW w:type="dxa" w:w="3528"/>
             <w:vAlign w:val="center"/>
           </w:tcPr>
           <w:p>
             <w:pPr>
               <w:spacing w:line="240" w:lineRule="auto" w:after="20"/>
               <w:ind w:firstLine="0"/>
-              <w:jc w:val="left"/>
             </w:pPr>
             <w:r/>
             <w:r>
@@ -2397,20 +2186,19 @@
                 <w:rFonts w:ascii="Times New Roman" w:hAnsi="Times New Roman" w:eastAsia="Times New Roman"/>
                 <w:sz w:val="19"/>
               </w:rPr>
-              <w:t>Hai LDR đối xứng, vách chắn; BH1750 tham chiếu.</w:t>
+              <w:t>4 LDR tại 4 góc, gá nghiêng hướng ra ngoài; BH1750 tham chiếu.</w:t>
             </w:r>
           </w:p>
         </w:tc>
         <w:tc>
           <w:tcPr>
-            <w:tcW w:type="dxa" w:w="4248"/>
+            <w:tcW w:type="dxa" w:w="3672"/>
             <w:vAlign w:val="center"/>
           </w:tcPr>
           <w:p>
             <w:pPr>
               <w:spacing w:line="240" w:lineRule="auto" w:after="20"/>
               <w:ind w:firstLine="0"/>
-              <w:jc w:val="left"/>
             </w:pPr>
             <w:r/>
             <w:r>
@@ -2418,7 +2206,7 @@
                 <w:rFonts w:ascii="Times New Roman" w:hAnsi="Times New Roman" w:eastAsia="Times New Roman"/>
                 <w:sz w:val="19"/>
               </w:rPr>
-              <w:t>Hiệu chuẩn độ lợi, tránh bão hòa; BH1750 có thể quá dải dưới nắng trực tiếp.</w:t>
+              <w:t>Đo bốn mức sáng; tạo sai lệch quay và nghiêng.</w:t>
             </w:r>
           </w:p>
         </w:tc>
@@ -2426,14 +2214,13 @@
       <w:tr>
         <w:tc>
           <w:tcPr>
-            <w:tcW w:type="dxa" w:w="1584"/>
+            <w:tcW w:type="dxa" w:w="1656"/>
             <w:vAlign w:val="center"/>
           </w:tcPr>
           <w:p>
             <w:pPr>
               <w:spacing w:line="240" w:lineRule="auto" w:after="20"/>
               <w:ind w:firstLine="0"/>
-              <w:jc w:val="left"/>
             </w:pPr>
             <w:r/>
             <w:r>
@@ -2441,20 +2228,19 @@
                 <w:rFonts w:ascii="Times New Roman" w:hAnsi="Times New Roman" w:eastAsia="Times New Roman"/>
                 <w:sz w:val="19"/>
               </w:rPr>
-              <w:t>Bộ điều khiển</w:t>
+              <w:t>Điều khiển</w:t>
             </w:r>
           </w:p>
         </w:tc>
         <w:tc>
           <w:tcPr>
-            <w:tcW w:type="dxa" w:w="3024"/>
+            <w:tcW w:type="dxa" w:w="3528"/>
             <w:vAlign w:val="center"/>
           </w:tcPr>
           <w:p>
             <w:pPr>
               <w:spacing w:line="240" w:lineRule="auto" w:after="20"/>
               <w:ind w:firstLine="0"/>
-              <w:jc w:val="left"/>
             </w:pPr>
             <w:r/>
             <w:r>
@@ -2462,20 +2248,19 @@
                 <w:rFonts w:ascii="Times New Roman" w:hAnsi="Times New Roman" w:eastAsia="Times New Roman"/>
                 <w:sz w:val="19"/>
               </w:rPr>
-              <w:t>ESP32; RTC DS3231 nếu không có đồng bộ thời gian khác [11].</w:t>
+              <w:t>ESP32 + RTC DS3231.</w:t>
             </w:r>
           </w:p>
         </w:tc>
         <w:tc>
           <w:tcPr>
-            <w:tcW w:type="dxa" w:w="4248"/>
+            <w:tcW w:type="dxa" w:w="3672"/>
             <w:vAlign w:val="center"/>
           </w:tcPr>
           <w:p>
             <w:pPr>
               <w:spacing w:line="240" w:lineRule="auto" w:after="20"/>
               <w:ind w:firstLine="0"/>
-              <w:jc w:val="left"/>
             </w:pPr>
             <w:r/>
             <w:r>
@@ -2483,7 +2268,7 @@
                 <w:rFonts w:ascii="Times New Roman" w:hAnsi="Times New Roman" w:eastAsia="Times New Roman"/>
                 <w:sz w:val="19"/>
               </w:rPr>
-              <w:t>Bảo vệ ADC đúng mức điện áp; kiểm tra thời gian và tọa độ.</w:t>
+              <w:t>Lọc tín hiệu, tính sai lệch, chạy thuật toán và ghi dữ liệu.</w:t>
             </w:r>
           </w:p>
         </w:tc>
@@ -2491,14 +2276,13 @@
       <w:tr>
         <w:tc>
           <w:tcPr>
-            <w:tcW w:type="dxa" w:w="1584"/>
+            <w:tcW w:type="dxa" w:w="1656"/>
             <w:vAlign w:val="center"/>
           </w:tcPr>
           <w:p>
             <w:pPr>
               <w:spacing w:line="240" w:lineRule="auto" w:after="20"/>
               <w:ind w:firstLine="0"/>
-              <w:jc w:val="left"/>
             </w:pPr>
             <w:r/>
             <w:r>
@@ -2506,20 +2290,19 @@
                 <w:rFonts w:ascii="Times New Roman" w:hAnsi="Times New Roman" w:eastAsia="Times New Roman"/>
                 <w:sz w:val="19"/>
               </w:rPr>
-              <w:t>Cơ cấu quay</w:t>
+              <w:t>Cơ khí</w:t>
             </w:r>
           </w:p>
         </w:tc>
         <w:tc>
           <w:tcPr>
-            <w:tcW w:type="dxa" w:w="3024"/>
+            <w:tcW w:type="dxa" w:w="3528"/>
             <w:vAlign w:val="center"/>
           </w:tcPr>
           <w:p>
             <w:pPr>
               <w:spacing w:line="240" w:lineRule="auto" w:after="20"/>
               <w:ind w:firstLine="0"/>
-              <w:jc w:val="left"/>
             </w:pPr>
             <w:r/>
             <w:r>
@@ -2527,20 +2310,19 @@
                 <w:rFonts w:ascii="Times New Roman" w:hAnsi="Times New Roman" w:eastAsia="Times New Roman"/>
                 <w:sz w:val="19"/>
               </w:rPr>
-              <w:t>Servo vị trí mô-men phù hợp hoặc actuator giảm tốc.</w:t>
+              <w:t>Mô hình trong phạm vi đề tài có một trục quay.</w:t>
             </w:r>
           </w:p>
         </w:tc>
         <w:tc>
           <w:tcPr>
-            <w:tcW w:type="dxa" w:w="4248"/>
+            <w:tcW w:type="dxa" w:w="3672"/>
             <w:vAlign w:val="center"/>
           </w:tcPr>
           <w:p>
             <w:pPr>
               <w:spacing w:line="240" w:lineRule="auto" w:after="20"/>
               <w:ind w:firstLine="0"/>
-              <w:jc w:val="left"/>
             </w:pPr>
             <w:r/>
             <w:r>
@@ -2548,7 +2330,7 @@
                 <w:rFonts w:ascii="Times New Roman" w:hAnsi="Times New Roman" w:eastAsia="Times New Roman"/>
                 <w:sz w:val="19"/>
               </w:rPr>
-              <w:t>Tính mô-men, cân bằng trục, giới hạn hành trình.</w:t>
+              <w:t>Dùng sai lệch ứng với trục lắp; thành phần còn lại được ghi nhận.</w:t>
             </w:r>
           </w:p>
         </w:tc>
@@ -2556,14 +2338,13 @@
       <w:tr>
         <w:tc>
           <w:tcPr>
-            <w:tcW w:type="dxa" w:w="1584"/>
+            <w:tcW w:type="dxa" w:w="1656"/>
             <w:vAlign w:val="center"/>
           </w:tcPr>
           <w:p>
             <w:pPr>
               <w:spacing w:line="240" w:lineRule="auto" w:after="20"/>
               <w:ind w:firstLine="0"/>
-              <w:jc w:val="left"/>
             </w:pPr>
             <w:r/>
             <w:r>
@@ -2577,14 +2358,13 @@
         </w:tc>
         <w:tc>
           <w:tcPr>
-            <w:tcW w:type="dxa" w:w="3024"/>
+            <w:tcW w:type="dxa" w:w="3528"/>
             <w:vAlign w:val="center"/>
           </w:tcPr>
           <w:p>
             <w:pPr>
               <w:spacing w:line="240" w:lineRule="auto" w:after="20"/>
               <w:ind w:firstLine="0"/>
-              <w:jc w:val="left"/>
             </w:pPr>
             <w:r/>
             <w:r>
@@ -2592,20 +2372,19 @@
                 <w:rFonts w:ascii="Times New Roman" w:hAnsi="Times New Roman" w:eastAsia="Times New Roman"/>
                 <w:sz w:val="19"/>
               </w:rPr>
-              <w:t>Hai công tắc hành trình, chặn mềm, nút dừng.</w:t>
+              <w:t>Cơ cấu chấp hành phù hợp tải + công tắc hành trình.</w:t>
             </w:r>
           </w:p>
         </w:tc>
         <w:tc>
           <w:tcPr>
-            <w:tcW w:type="dxa" w:w="4248"/>
+            <w:tcW w:type="dxa" w:w="3672"/>
             <w:vAlign w:val="center"/>
           </w:tcPr>
           <w:p>
             <w:pPr>
               <w:spacing w:line="240" w:lineRule="auto" w:after="20"/>
               <w:ind w:firstLine="0"/>
-              <w:jc w:val="left"/>
             </w:pPr>
             <w:r/>
             <w:r>
@@ -2613,7 +2392,7 @@
                 <w:rFonts w:ascii="Times New Roman" w:hAnsi="Times New Roman" w:eastAsia="Times New Roman"/>
                 <w:sz w:val="19"/>
               </w:rPr>
-              <w:t>Công tắc có quyền ưu tiên dừng; chống dội tín hiệu.</w:t>
+              <w:t>Giới hạn chuyển động và dừng an toàn.</w:t>
             </w:r>
           </w:p>
         </w:tc>
@@ -2621,14 +2400,13 @@
       <w:tr>
         <w:tc>
           <w:tcPr>
-            <w:tcW w:type="dxa" w:w="1584"/>
+            <w:tcW w:type="dxa" w:w="1656"/>
             <w:vAlign w:val="center"/>
           </w:tcPr>
           <w:p>
             <w:pPr>
               <w:spacing w:line="240" w:lineRule="auto" w:after="20"/>
               <w:ind w:firstLine="0"/>
-              <w:jc w:val="left"/>
             </w:pPr>
             <w:r/>
             <w:r>
@@ -2642,14 +2420,13 @@
         </w:tc>
         <w:tc>
           <w:tcPr>
-            <w:tcW w:type="dxa" w:w="3024"/>
+            <w:tcW w:type="dxa" w:w="3528"/>
             <w:vAlign w:val="center"/>
           </w:tcPr>
           <w:p>
             <w:pPr>
               <w:spacing w:line="240" w:lineRule="auto" w:after="20"/>
               <w:ind w:firstLine="0"/>
-              <w:jc w:val="left"/>
             </w:pPr>
             <w:r/>
             <w:r>
@@ -2657,20 +2434,19 @@
                 <w:rFonts w:ascii="Times New Roman" w:hAnsi="Times New Roman" w:eastAsia="Times New Roman"/>
                 <w:sz w:val="19"/>
               </w:rPr>
-              <w:t>Đo U, I của pin và dòng/điện năng actuator.</w:t>
+              <w:t>Đo U, I pin và điện năng actuator.</w:t>
             </w:r>
           </w:p>
         </w:tc>
         <w:tc>
           <w:tcPr>
-            <w:tcW w:type="dxa" w:w="4248"/>
+            <w:tcW w:type="dxa" w:w="3672"/>
             <w:vAlign w:val="center"/>
           </w:tcPr>
           <w:p>
             <w:pPr>
               <w:spacing w:line="240" w:lineRule="auto" w:after="20"/>
               <w:ind w:firstLine="0"/>
-              <w:jc w:val="left"/>
             </w:pPr>
             <w:r/>
             <w:r>
@@ -2678,7 +2454,7 @@
                 <w:rFonts w:ascii="Times New Roman" w:hAnsi="Times New Roman" w:eastAsia="Times New Roman"/>
                 <w:sz w:val="19"/>
               </w:rPr>
-              <w:t>Cùng điều kiện tải, ghi thời tiết và chu kỳ lấy mẫu.</w:t>
+              <w:t>Đánh giá năng lượng thuần và chuyển động.</w:t>
             </w:r>
           </w:p>
         </w:tc>
@@ -2686,8 +2462,11 @@
     </w:tbl>
     <w:p>
       <w:pPr>
-        <w:spacing w:after="20"/>
+        <w:jc w:val="both"/>
       </w:pPr>
+      <w:r>
+        <w:t>Cụm cảm biến cung cấp hai tín hiệu hướng độc lập, nhưng mô hình một trục chỉ có một bậc tự do cơ khí. Vì vậy, cần chọn trước trục thực sự được điều khiển; tín hiệu trục còn lại chỉ dùng để giám sát, phân tích hoặc làm cơ sở đề xuất mở rộng thành tracker hai trục. Không kết luận mô hình một trục đã tự điều chỉnh được đồng thời cả phương vị và góc cao.</w:t>
+      </w:r>
     </w:p>
     <w:p>
       <w:pPr>
@@ -2698,23 +2477,418 @@
       </w:r>
     </w:p>
     <w:p>
-      <w:pPr/>
+      <w:pPr>
+        <w:jc w:val="both"/>
+      </w:pPr>
       <w:r>
-        <w:rPr>
-          <w:rFonts w:ascii="Times New Roman" w:hAnsi="Times New Roman" w:eastAsia="Times New Roman"/>
-          <w:sz w:val="24"/>
-        </w:rPr>
-        <w:t>Hai LDR được mắc thành hai mạch chia áp riêng, đưa vào hai kênh ADC. Điện trở cố định được chọn sau khi đo dải điện trở của cảm biến trong điều kiện tối, ánh sáng trong nhà và nắng ngoài trời để tín hiệu không bão hòa và vẫn có độ phân giải hữu ích. Tấm chắn đặt giữa hai phần tử, song song với trục quay; kích thước của vách được tinh chỉnh qua thử nghiệm để tạo vùng tuyến tính đủ rộng.</w:t>
+        <w:t>Bốn cảm biến đặt đối xứng ở bốn góc tấm pin. Nhìn từ phía trước mặt pin, L_TT là góc trên-trái, L_PT là trên-phải, L_TD là dưới-trái và L_PD là dưới-phải. Mỗi cảm biến hướng chếch ra ngoài khỏi tâm cụm một góc β_s so với pháp tuyến mặt pin; chọn cùng giá đỡ, cùng góc và tránh để khung, cáp hoặc cảm biến bên cạnh che khuất trường nhìn.</w:t>
+      </w:r>
+    </w:p>
+    <w:tbl>
+      <w:tblPr>
+        <w:tblStyle w:val="TableGrid"/>
+        <w:tblW w:type="auto" w:w="0"/>
+        <w:jc w:val="center"/>
+        <w:tblLayout w:type="fixed"/>
+        <w:tblLook w:firstColumn="1" w:firstRow="1" w:lastColumn="0" w:lastRow="0" w:noHBand="0" w:noVBand="1" w:val="04A0"/>
+      </w:tblPr>
+      <w:tblGrid>
+        <w:gridCol w:w="2160"/>
+        <w:gridCol w:w="1728"/>
+        <w:gridCol w:w="4968"/>
+      </w:tblGrid>
+      <w:tr>
+        <w:trPr>
+          <w:tblHeader w:val="true"/>
+        </w:trPr>
+        <w:tc>
+          <w:tcPr>
+            <w:tcW w:type="dxa" w:w="2160"/>
+            <w:vAlign w:val="center"/>
+            <w:shd w:fill="D9EAF7"/>
+          </w:tcPr>
+          <w:p>
+            <w:pPr>
+              <w:spacing w:after="0"/>
+              <w:ind w:firstLine="0"/>
+              <w:jc w:val="center"/>
+            </w:pPr>
+            <w:r/>
+            <w:r>
+              <w:rPr>
+                <w:rFonts w:ascii="Times New Roman" w:hAnsi="Times New Roman" w:eastAsia="Times New Roman"/>
+                <w:b/>
+                <w:sz w:val="19"/>
+              </w:rPr>
+              <w:t>Vị trí</w:t>
+            </w:r>
+          </w:p>
+        </w:tc>
+        <w:tc>
+          <w:tcPr>
+            <w:tcW w:type="dxa" w:w="1728"/>
+            <w:vAlign w:val="center"/>
+            <w:shd w:fill="D9EAF7"/>
+          </w:tcPr>
+          <w:p>
+            <w:pPr>
+              <w:spacing w:after="0"/>
+              <w:ind w:firstLine="0"/>
+              <w:jc w:val="center"/>
+            </w:pPr>
+            <w:r/>
+            <w:r>
+              <w:rPr>
+                <w:rFonts w:ascii="Times New Roman" w:hAnsi="Times New Roman" w:eastAsia="Times New Roman"/>
+                <w:b/>
+                <w:sz w:val="19"/>
+              </w:rPr>
+              <w:t>Ký hiệu</w:t>
+            </w:r>
+          </w:p>
+        </w:tc>
+        <w:tc>
+          <w:tcPr>
+            <w:tcW w:type="dxa" w:w="4968"/>
+            <w:vAlign w:val="center"/>
+            <w:shd w:fill="D9EAF7"/>
+          </w:tcPr>
+          <w:p>
+            <w:pPr>
+              <w:spacing w:after="0"/>
+              <w:ind w:firstLine="0"/>
+              <w:jc w:val="center"/>
+            </w:pPr>
+            <w:r/>
+            <w:r>
+              <w:rPr>
+                <w:rFonts w:ascii="Times New Roman" w:hAnsi="Times New Roman" w:eastAsia="Times New Roman"/>
+                <w:b/>
+                <w:sz w:val="19"/>
+              </w:rPr>
+              <w:t>Hướng gá</w:t>
+            </w:r>
+          </w:p>
+        </w:tc>
+      </w:tr>
+      <w:tr>
+        <w:tc>
+          <w:tcPr>
+            <w:tcW w:type="dxa" w:w="2160"/>
+            <w:vAlign w:val="center"/>
+          </w:tcPr>
+          <w:p>
+            <w:pPr>
+              <w:spacing w:line="240" w:lineRule="auto" w:after="20"/>
+              <w:ind w:firstLine="0"/>
+            </w:pPr>
+            <w:r/>
+            <w:r>
+              <w:rPr>
+                <w:rFonts w:ascii="Times New Roman" w:hAnsi="Times New Roman" w:eastAsia="Times New Roman"/>
+                <w:sz w:val="19"/>
+              </w:rPr>
+              <w:t>Trên – trái</w:t>
+            </w:r>
+          </w:p>
+        </w:tc>
+        <w:tc>
+          <w:tcPr>
+            <w:tcW w:type="dxa" w:w="1728"/>
+            <w:vAlign w:val="center"/>
+          </w:tcPr>
+          <w:p>
+            <w:pPr>
+              <w:spacing w:line="240" w:lineRule="auto" w:after="20"/>
+              <w:ind w:firstLine="0"/>
+            </w:pPr>
+            <w:r/>
+            <w:r>
+              <w:rPr>
+                <w:rFonts w:ascii="Times New Roman" w:hAnsi="Times New Roman" w:eastAsia="Times New Roman"/>
+                <w:sz w:val="19"/>
+              </w:rPr>
+              <w:t>L_TT</w:t>
+            </w:r>
+          </w:p>
+        </w:tc>
+        <w:tc>
+          <w:tcPr>
+            <w:tcW w:type="dxa" w:w="4968"/>
+            <w:vAlign w:val="center"/>
+          </w:tcPr>
+          <w:p>
+            <w:pPr>
+              <w:spacing w:line="240" w:lineRule="auto" w:after="20"/>
+              <w:ind w:firstLine="0"/>
+            </w:pPr>
+            <w:r/>
+            <w:r>
+              <w:rPr>
+                <w:rFonts w:ascii="Times New Roman" w:hAnsi="Times New Roman" w:eastAsia="Times New Roman"/>
+                <w:sz w:val="19"/>
+              </w:rPr>
+              <w:t>Chếch ra ngoài về phía trên-trái.</w:t>
+            </w:r>
+          </w:p>
+        </w:tc>
+      </w:tr>
+      <w:tr>
+        <w:tc>
+          <w:tcPr>
+            <w:tcW w:type="dxa" w:w="2160"/>
+            <w:vAlign w:val="center"/>
+          </w:tcPr>
+          <w:p>
+            <w:pPr>
+              <w:spacing w:line="240" w:lineRule="auto" w:after="20"/>
+              <w:ind w:firstLine="0"/>
+            </w:pPr>
+            <w:r/>
+            <w:r>
+              <w:rPr>
+                <w:rFonts w:ascii="Times New Roman" w:hAnsi="Times New Roman" w:eastAsia="Times New Roman"/>
+                <w:sz w:val="19"/>
+              </w:rPr>
+              <w:t>Trên – phải</w:t>
+            </w:r>
+          </w:p>
+        </w:tc>
+        <w:tc>
+          <w:tcPr>
+            <w:tcW w:type="dxa" w:w="1728"/>
+            <w:vAlign w:val="center"/>
+          </w:tcPr>
+          <w:p>
+            <w:pPr>
+              <w:spacing w:line="240" w:lineRule="auto" w:after="20"/>
+              <w:ind w:firstLine="0"/>
+            </w:pPr>
+            <w:r/>
+            <w:r>
+              <w:rPr>
+                <w:rFonts w:ascii="Times New Roman" w:hAnsi="Times New Roman" w:eastAsia="Times New Roman"/>
+                <w:sz w:val="19"/>
+              </w:rPr>
+              <w:t>L_PT</w:t>
+            </w:r>
+          </w:p>
+        </w:tc>
+        <w:tc>
+          <w:tcPr>
+            <w:tcW w:type="dxa" w:w="4968"/>
+            <w:vAlign w:val="center"/>
+          </w:tcPr>
+          <w:p>
+            <w:pPr>
+              <w:spacing w:line="240" w:lineRule="auto" w:after="20"/>
+              <w:ind w:firstLine="0"/>
+            </w:pPr>
+            <w:r/>
+            <w:r>
+              <w:rPr>
+                <w:rFonts w:ascii="Times New Roman" w:hAnsi="Times New Roman" w:eastAsia="Times New Roman"/>
+                <w:sz w:val="19"/>
+              </w:rPr>
+              <w:t>Chếch ra ngoài về phía trên-phải.</w:t>
+            </w:r>
+          </w:p>
+        </w:tc>
+      </w:tr>
+      <w:tr>
+        <w:tc>
+          <w:tcPr>
+            <w:tcW w:type="dxa" w:w="2160"/>
+            <w:vAlign w:val="center"/>
+          </w:tcPr>
+          <w:p>
+            <w:pPr>
+              <w:spacing w:line="240" w:lineRule="auto" w:after="20"/>
+              <w:ind w:firstLine="0"/>
+            </w:pPr>
+            <w:r/>
+            <w:r>
+              <w:rPr>
+                <w:rFonts w:ascii="Times New Roman" w:hAnsi="Times New Roman" w:eastAsia="Times New Roman"/>
+                <w:sz w:val="19"/>
+              </w:rPr>
+              <w:t>Dưới – trái</w:t>
+            </w:r>
+          </w:p>
+        </w:tc>
+        <w:tc>
+          <w:tcPr>
+            <w:tcW w:type="dxa" w:w="1728"/>
+            <w:vAlign w:val="center"/>
+          </w:tcPr>
+          <w:p>
+            <w:pPr>
+              <w:spacing w:line="240" w:lineRule="auto" w:after="20"/>
+              <w:ind w:firstLine="0"/>
+            </w:pPr>
+            <w:r/>
+            <w:r>
+              <w:rPr>
+                <w:rFonts w:ascii="Times New Roman" w:hAnsi="Times New Roman" w:eastAsia="Times New Roman"/>
+                <w:sz w:val="19"/>
+              </w:rPr>
+              <w:t>L_TD</w:t>
+            </w:r>
+          </w:p>
+        </w:tc>
+        <w:tc>
+          <w:tcPr>
+            <w:tcW w:type="dxa" w:w="4968"/>
+            <w:vAlign w:val="center"/>
+          </w:tcPr>
+          <w:p>
+            <w:pPr>
+              <w:spacing w:line="240" w:lineRule="auto" w:after="20"/>
+              <w:ind w:firstLine="0"/>
+            </w:pPr>
+            <w:r/>
+            <w:r>
+              <w:rPr>
+                <w:rFonts w:ascii="Times New Roman" w:hAnsi="Times New Roman" w:eastAsia="Times New Roman"/>
+                <w:sz w:val="19"/>
+              </w:rPr>
+              <w:t>Chếch ra ngoài về phía dưới-trái.</w:t>
+            </w:r>
+          </w:p>
+        </w:tc>
+      </w:tr>
+      <w:tr>
+        <w:tc>
+          <w:tcPr>
+            <w:tcW w:type="dxa" w:w="2160"/>
+            <w:vAlign w:val="center"/>
+          </w:tcPr>
+          <w:p>
+            <w:pPr>
+              <w:spacing w:line="240" w:lineRule="auto" w:after="20"/>
+              <w:ind w:firstLine="0"/>
+            </w:pPr>
+            <w:r/>
+            <w:r>
+              <w:rPr>
+                <w:rFonts w:ascii="Times New Roman" w:hAnsi="Times New Roman" w:eastAsia="Times New Roman"/>
+                <w:sz w:val="19"/>
+              </w:rPr>
+              <w:t>Dưới – phải</w:t>
+            </w:r>
+          </w:p>
+        </w:tc>
+        <w:tc>
+          <w:tcPr>
+            <w:tcW w:type="dxa" w:w="1728"/>
+            <w:vAlign w:val="center"/>
+          </w:tcPr>
+          <w:p>
+            <w:pPr>
+              <w:spacing w:line="240" w:lineRule="auto" w:after="20"/>
+              <w:ind w:firstLine="0"/>
+            </w:pPr>
+            <w:r/>
+            <w:r>
+              <w:rPr>
+                <w:rFonts w:ascii="Times New Roman" w:hAnsi="Times New Roman" w:eastAsia="Times New Roman"/>
+                <w:sz w:val="19"/>
+              </w:rPr>
+              <w:t>L_PD</w:t>
+            </w:r>
+          </w:p>
+        </w:tc>
+        <w:tc>
+          <w:tcPr>
+            <w:tcW w:type="dxa" w:w="4968"/>
+            <w:vAlign w:val="center"/>
+          </w:tcPr>
+          <w:p>
+            <w:pPr>
+              <w:spacing w:line="240" w:lineRule="auto" w:after="20"/>
+              <w:ind w:firstLine="0"/>
+            </w:pPr>
+            <w:r/>
+            <w:r>
+              <w:rPr>
+                <w:rFonts w:ascii="Times New Roman" w:hAnsi="Times New Roman" w:eastAsia="Times New Roman"/>
+                <w:sz w:val="19"/>
+              </w:rPr>
+              <w:t>Chếch ra ngoài về phía dưới-phải.</w:t>
+            </w:r>
+          </w:p>
+        </w:tc>
+      </w:tr>
+    </w:tbl>
+    <w:p>
+      <w:pPr>
+        <w:jc w:val="both"/>
+      </w:pPr>
+      <w:r>
+        <w:t>Chọn góc gá β_s bằng thử nghiệm thay vì mặc định một con số: đặt cụm cảm biến trên giá quay, chiếu sáng từ các hướng đã biết, thử một số góc gá đối xứng và chọn vùng mà chênh lệch tín hiệu đổi dấu đúng chiều, biến thiên đủ rõ nhưng không làm cảm biến bão hòa hoặc bị che. Cố định chắc giá sau hiệu chuẩn và ghi lại góc gá thực tế.</w:t>
       </w:r>
     </w:p>
     <w:p>
-      <w:pPr/>
+      <w:pPr>
+        <w:jc w:val="both"/>
+      </w:pPr>
+      <w:r>
+        <w:t>Mắc mỗi LDR thành mạch chia áp riêng, lấy nhiều mẫu ADC để lọc nhiễu. Trước hết hiệu chuẩn độ lệch/độ lợi của bốn kênh dưới cùng một nguồn sáng khuếch tán; sau đó thay đổi hướng chiếu có kiểm soát để kiểm tra dấu, độ nhạy và vùng tuyến tính. BH1750 chỉ làm kênh tham chiếu tương đối nếu dải đo đáp ứng; dưới nắng trực tiếp cảm biến độ rọi phổ thông có thể bão hòa.</w:t>
+      </w:r>
+    </w:p>
+    <w:p>
+      <w:pPr>
+        <w:jc w:val="both"/>
+      </w:pPr>
+      <w:r>
+        <w:t>Để tính hướng, tổng tín hiệu được xác định S = L_TT + L_PT + L_TD + L_PD + ε. Chênh lệch trái–phải biểu diễn hướng quay; chênh lệch trên–dưới biểu diễn hướng nghiêng. Chuẩn hóa theo S giúp giảm phụ thuộc độ sáng chung; khi S thấp hoặc thay đổi quá nhanh, không dùng tín hiệu quang để ra lệnh.</w:t>
+      </w:r>
+    </w:p>
+    <w:p>
+      <w:pPr>
+        <w:spacing w:before="60" w:after="140"/>
+        <w:ind w:firstLine="0"/>
+        <w:jc w:val="center"/>
+      </w:pPr>
       <w:r>
         <w:rPr>
-          <w:rFonts w:ascii="Times New Roman" w:hAnsi="Times New Roman" w:eastAsia="Times New Roman"/>
-          <w:sz w:val="24"/>
+          <w:i/>
         </w:rPr>
-        <w:t>Hiệu chuẩn được thực hiện khi hai cảm biến nhận cùng ánh sáng: ghi nhiều cặp số đo và xác định hệ số bù g; sau đó xoay cảm biến theo các góc đã biết để lập quan hệ giữa e và góc lệch. BH1750 chỉ dùng làm tham chiếu tương đối nếu không bảo đảm đủ dải đo; khi cần đo ngoài trời định lượng phải chọn cảm biến bức xạ/độ rọi có dải phù hợp và nêu rõ hiệu chuẩn.</w:t>
+        <w:t>e_quay = [(L_PT + L_PD) − (L_TT + L_TD)] / S</w:t>
+      </w:r>
+    </w:p>
+    <w:p>
+      <w:pPr>
+        <w:spacing w:before="60" w:after="140"/>
+        <w:ind w:firstLine="0"/>
+        <w:jc w:val="center"/>
+      </w:pPr>
+      <w:r>
+        <w:rPr>
+          <w:i/>
+        </w:rPr>
+        <w:t>e_nghiêng = [(L_TT + L_PT) − (L_TD + L_PD)] / S</w:t>
+      </w:r>
+    </w:p>
+    <w:p>
+      <w:pPr>
+        <w:spacing w:before="60" w:after="140"/>
+        <w:ind w:firstLine="0"/>
+        <w:jc w:val="center"/>
+      </w:pPr>
+      <w:r>
+        <w:rPr>
+          <w:i/>
+        </w:rPr>
+        <w:t>e_chéo = [(L_TT + L_PD) − (L_PT + L_TD)] / S</w:t>
+      </w:r>
+    </w:p>
+    <w:p>
+      <w:pPr>
+        <w:jc w:val="both"/>
+      </w:pPr>
+      <w:r>
+        <w:t>e_chéo dùng như chỉ báo kiểm tra bất đối xứng/che bóng theo đường chéo; không thay thế hai sai lệch điều khiển chính. Dấu dương của e_quay/e_nghiêng chỉ chiều cần chuyển động sau khi kiểm tra trên phần cứng; nếu đấu ADC hoặc gá cảm biến theo chiều ngược thì dấu lệnh phải hiệu chuẩn lại.</w:t>
       </w:r>
     </w:p>
     <w:p>
@@ -2754,89 +2928,35 @@
       </w:r>
     </w:p>
     <w:p>
-      <w:pPr/>
+      <w:pPr>
+        <w:jc w:val="both"/>
+      </w:pPr>
       <w:r>
-        <w:rPr>
-          <w:rFonts w:ascii="Times New Roman" w:hAnsi="Times New Roman" w:eastAsia="Times New Roman"/>
-          <w:sz w:val="24"/>
-        </w:rPr>
-        <w:t>Mỗi chu kỳ điều khiển thực hiện các bước: đọc nhiều mẫu LDR và lấy trung vị; bù độ lợi g; lọc tín hiệu; tính tổng sáng S và sai lệch chuẩn hóa e; kiểm tra độ sáng, độ biến động và dấu hiệu bão hòa; xác định góc đặt bằng thuật toán đang thử; giới hạn lệnh theo hành trình; điều khiển actuator và ghi trạng thái.</w:t>
-      </w:r>
-    </w:p>
-    <w:p>
-      <w:pPr/>
-      <w:r>
-        <w:rPr>
-          <w:rFonts w:ascii="Times New Roman" w:hAnsi="Times New Roman" w:eastAsia="Times New Roman"/>
-          <w:sz w:val="24"/>
-        </w:rPr>
-        <w:t>Các phương án so sánh gồm A1 – so sánh có ngưỡng; A2 – điều khiển tỷ lệ; A3 – tỷ lệ có lọc, bù độ lợi và vùng chết; A4 – phương án lai, dùng A3 khi tín hiệu quang đáng tin cậy và dùng vị trí Mặt Trời tính toán hoặc giữ vị trí khi tín hiệu không hợp lệ. Hai ngưỡng chất lượng sáng khác nhau được sử dụng để vào/ra chế độ cảm biến, tránh đổi qua lại khi mây đi nhanh.</w:t>
-      </w:r>
-    </w:p>
-    <w:p>
-      <w:pPr/>
-      <w:r>
-        <w:rPr>
-          <w:rFonts w:ascii="Times New Roman" w:hAnsi="Times New Roman" w:eastAsia="Times New Roman"/>
-          <w:sz w:val="24"/>
-        </w:rPr>
-        <w:t>Khi trời tối hoặc góc cao Mặt Trời dưới ngưỡng vận hành, dừng bám và đưa tấm pin về vị trí nghỉ đã xác định nếu cơ khí cho phép. Khi phát hiện lỗi LDR, lỗi đồng hồ, công tắc hành trình hoặc quá dòng, ngừng lệnh gây nguy hiểm, lưu mã trạng thái và chờ xử lý.</w:t>
+        <w:t>Mỗi chu kỳ, ESP32 đọc bốn kênh LDR, loại mẫu đột biến, hiệu chuẩn offset/độ lợi và tính e_quay, e_nghiêng, e_chéo. Sau đó kiểm tra tổng sáng S, mức bão hòa, độ biến động và tính nhất quán giữa các cảm biến. Chỉ sai lệch ứng với trục cơ khí đang có trong mô hình một trục được đưa sang khối phát lệnh; sai lệch còn lại được ghi log hoặc dùng để cảnh báo hướng đặt chưa phù hợp.</w:t>
       </w:r>
     </w:p>
     <w:p>
       <w:pPr>
-        <w:spacing w:after="40"/>
-        <w:ind w:firstLine="0"/>
-        <w:jc w:val="center"/>
+        <w:jc w:val="both"/>
       </w:pPr>
       <w:r>
-        <w:drawing>
-          <wp:inline xmlns:a="http://schemas.openxmlformats.org/drawingml/2006/main" xmlns:pic="http://schemas.openxmlformats.org/drawingml/2006/picture">
-            <wp:extent cx="4480560" cy="2140748"/>
-            <wp:docPr id="4" name="Picture 4"/>
-            <wp:cNvGraphicFramePr>
-              <a:graphicFrameLocks noChangeAspect="1"/>
-            </wp:cNvGraphicFramePr>
-            <a:graphic>
-              <a:graphicData uri="http://schemas.openxmlformats.org/drawingml/2006/picture">
-                <pic:pic>
-                  <pic:nvPicPr>
-                    <pic:cNvPr id="0" name="image.png"/>
-                    <pic:cNvPicPr/>
-                  </pic:nvPicPr>
-                  <pic:blipFill>
-                    <a:blip r:embed="rId12"/>
-                    <a:stretch>
-                      <a:fillRect/>
-                    </a:stretch>
-                  </pic:blipFill>
-                  <pic:spPr>
-                    <a:xfrm>
-                      <a:off x="0" y="0"/>
-                      <a:ext cx="4480560" cy="2140748"/>
-                    </a:xfrm>
-                    <a:prstGeom prst="rect"/>
-                  </pic:spPr>
-                </pic:pic>
-              </a:graphicData>
-            </a:graphic>
-          </wp:inline>
-        </w:drawing>
+        <w:t>Với sai lệch điều khiển e_a và vùng chết δ, có thể dùng hàm f(e_a,δ) = 0 khi |e_a| ≤ δ; ngoài vùng chết, f(e_a,δ) = sign(e_a)(|e_a|−δ). Góc đặt cập nhật theo θ*_k+1 = sat[θ*_k + K_a f(e_a,δ), θ_min, θ_max], trong đó K_a là hệ số hiệu chỉnh góc trên mỗi chu kỳ, sat giới hạn lệnh trong hành trình an toàn.</w:t>
       </w:r>
     </w:p>
     <w:p>
       <w:pPr>
-        <w:pStyle w:val="Caption"/>
-        <w:ind w:firstLine="0"/>
-        <w:jc w:val="center"/>
+        <w:jc w:val="both"/>
       </w:pPr>
       <w:r>
-        <w:rPr>
-          <w:rFonts w:ascii="Times New Roman" w:hAnsi="Times New Roman" w:eastAsia="Times New Roman"/>
-          <w:color w:val="505050"/>
-          <w:sz w:val="20"/>
-        </w:rPr>
-        <w:t>Hình 3.2. Lưu đồ nguyên lý của thuật toán lai cảm biến – thiên văn.</w:t>
+        <w:t>A1 dùng quy tắc đóng–ngắt khi sai lệch vượt ngưỡng; A2 dùng bước quay tỷ lệ với sai lệch; A3 thêm lọc, bù khác biệt giữa bốn cảm biến và vùng chết; A4 chỉ dùng hiệu chỉnh LDR khi tín hiệu đủ sáng, ổn định, còn khi mây che hoặc cảm biến lỗi thì chuyển sang góc thiên văn/giữ vị trí. Các hệ số và ngưỡng phải được hiệu chuẩn trên mô hình, không lấy một bộ số dùng chung cho mọi cơ cấu.</w:t>
+      </w:r>
+    </w:p>
+    <w:p>
+      <w:pPr>
+        <w:jc w:val="both"/>
+      </w:pPr>
+      <w:r>
+        <w:t>Khi lắp đủ hai bậc tự do, cùng một cụm bốn LDR có thể đưa e_quay tới động cơ phương vị và e_nghiêng tới động cơ góc cao. Cấu hình đó nằm ngoài phần cơ khí một trục hiện tại, nhưng là hướng mở rộng tự nhiên của phương pháp cảm biến.</w:t>
       </w:r>
     </w:p>
     <w:p>
@@ -2848,13 +2968,19 @@
       </w:r>
     </w:p>
     <w:p>
-      <w:pPr/>
+      <w:pPr>
+        <w:jc w:val="both"/>
+      </w:pPr>
       <w:r>
-        <w:rPr>
-          <w:rFonts w:ascii="Times New Roman" w:hAnsi="Times New Roman" w:eastAsia="Times New Roman"/>
-          <w:sz w:val="24"/>
-        </w:rPr>
-        <w:t>Chương trình nên tách thành các khối: đọc cảm biến; hiệu chuẩn/lọc; tính vị trí Mặt Trời từ RTC và tọa độ; đánh giá chất lượng tín hiệu; tạo góc tham chiếu; điều khiển actuator; xử lý giới hạn/lỗi; và ghi dữ liệu. Các tham số như chu kỳ lấy mẫu, hệ số lọc, hệ số bù, vùng chết, góc nghỉ và ngưỡng sáng được lưu tập trung để dễ hiệu chỉnh. Nếu dùng ESP32, phải kiểm tra dải điện áp ADC và nhiễu từ nguồn động cơ; không để dòng khởi động servo làm sụt nguồn vi điều khiển.</w:t>
+        <w:t>Chương trình nên tách thành các khối: đọc bốn ADC; bù sai khác và lọc; tính S cùng ba sai lệch; đánh giá chất lượng ánh sáng; chọn thành phần điều khiển phù hợp với trục đang lắp; tính vị trí Mặt Trời dự phòng; giới hạn lệnh; giám sát công tắc hành trình/lỗi; và ghi dữ liệu. Lưu riêng L_TT, L_PT, L_TD, L_PD, e_quay, e_nghiêng, e_chéo, góc đặt, trạng thái giới hạn và U/I để kiểm tra lại thuật toán.</w:t>
+      </w:r>
+    </w:p>
+    <w:p>
+      <w:pPr>
+        <w:jc w:val="both"/>
+      </w:pPr>
+      <w:r>
+        <w:t>Nếu dùng ESP32, bảo vệ chân ADC khỏi quá áp và nhiễu; nguồn actuator không được làm sụt nguồn điều khiển. Góc gá β_s, hệ số hiệu chuẩn, chu kỳ lấy mẫu, hệ số lọc, vùng chết và giới hạn góc cần được lưu thành tham số để có thể hiệu chỉnh mà không sửa nhiều vị trí trong chương trình.</w:t>
       </w:r>
     </w:p>
     <w:p>
@@ -2866,28 +2992,19 @@
       </w:r>
     </w:p>
     <w:p>
-      <w:pPr/>
+      <w:pPr>
+        <w:jc w:val="both"/>
+      </w:pPr>
       <w:r>
-        <w:rPr>
-          <w:rFonts w:ascii="Times New Roman" w:hAnsi="Times New Roman" w:eastAsia="Times New Roman"/>
-          <w:sz w:val="24"/>
-        </w:rPr>
-        <w:t>Trước khi chạy tự động, kiểm tra riêng từng khối: chiều tăng/giảm của ADC khi che cảm biến; dấu sai lệch khi chiếu sáng một phía; hướng quay lệnh; phản ứng với từng công tắc hành trình; và vị trí nghỉ. Sau đó kiểm thử phần mềm với chuỗi ngày/giờ và tín hiệu cảm biến đại diện cho trời quang, mây che, ánh sáng thấp và lỗi cảm biến; nếu mô phỏng bằng Python, có thể đối chiếu vị trí Mặt Trời bằng thư viện pvlib [12].</w:t>
+        <w:t>Trước khi chạy tự động, kiểm tra từng LDR bằng cách chiếu sáng riêng từng hướng; xác nhận thứ tự bốn kênh, chiều dấu e_quay/e_nghiêng và độ lặp lại của các lần đo. Thử góc gá β_s trong nhiều hướng sáng, kiểm tra ánh sáng bị khung che, rồi xác định vùng chết để cơ cấu không rung khi sai lệch nhỏ.</w:t>
       </w:r>
     </w:p>
     <w:p>
-      <w:pPr/>
+      <w:pPr>
+        <w:jc w:val="both"/>
+      </w:pPr>
       <w:r>
-        <w:rPr>
-          <w:rFonts w:ascii="Times New Roman" w:hAnsi="Times New Roman" w:eastAsia="Times New Roman"/>
-          <w:sz w:val="24"/>
-        </w:rPr>
-        <w:t>Khi có mô hình, so sánh tấm pin cố định với các chế độ A1–A4 trong cùng thời gian và điều kiện tải. Ghi góc đặt, góc đo, tín hiệu LDR, cường độ sáng tham chiếu, điện áp–dòng của pin, dòng actuator và trạng thái thời tiết. Từ dữ liệu này tính sai số góc, số lần chuyển động và năng lượng thuần; chỉ sau đó mới đưa ra nhận xét định lượng.</w:t>
-      </w:r>
-    </w:p>
-    <w:p>
-      <w:r>
-        <w:br w:type="page"/>
+        <w:t>Khi thử mô hình một trục, ghi cả bốn tín hiệu nhưng chỉ điều khiển một sai lệch tương ứng với trục có thật. So sánh tấm pin cố định với các thuật toán A1–A4 trong cùng thời gian/tải; ghi góc, tín hiệu cảm biến, độ sáng tham chiếu, điện áp–dòng pin, điện năng actuator và thời tiết. Tính sai số góc, số/quãng chuyển động và năng lượng thuần; không suy ra kết quả hai trục từ phép đo một trục.</w:t>
       </w:r>
     </w:p>
     <w:p>

</xml_diff>